<commit_message>
Added FSDI 113 Assignement 2
</commit_message>
<xml_diff>
--- a/FSDI 113 Assignment 1.docx
+++ b/FSDI 113 Assignment 1.docx
@@ -119,7 +119,13 @@
         <w:rPr>
           <w:rFonts w:ascii="Arial" w:hAnsi="Arial" w:cs="Arial"/>
         </w:rPr>
-        <w:t xml:space="preserve"> Assignment 1</w:t>
+        <w:t xml:space="preserve"> Assignment </w:t>
+      </w:r>
+      <w:r>
+        <w:rPr>
+          <w:rFonts w:ascii="Arial" w:hAnsi="Arial" w:cs="Arial"/>
+        </w:rPr>
+        <w:t>2</w:t>
       </w:r>
     </w:p>
     <w:p>
@@ -274,7 +280,7 @@
           <w:b/>
           <w:bCs/>
         </w:rPr>
-        <w:t>Creating New User Account</w:t>
+        <w:t xml:space="preserve">Requirement to login to see posts: </w:t>
       </w:r>
     </w:p>
     <w:p>
@@ -291,13 +297,12 @@
           <w:rFonts w:ascii="Arial" w:hAnsi="Arial" w:cs="Arial"/>
           <w:b/>
           <w:bCs/>
-          <w:noProof/>
         </w:rPr>
         <w:drawing>
-          <wp:inline distT="0" distB="0" distL="0" distR="0" wp14:anchorId="5FEFCFAF" wp14:editId="4747E873">
-            <wp:extent cx="5943600" cy="2259330"/>
-            <wp:effectExtent l="0" t="0" r="0" b="7620"/>
-            <wp:docPr id="1451810450" name="Picture 1"/>
+          <wp:inline distT="0" distB="0" distL="0" distR="0" wp14:anchorId="51E8346C" wp14:editId="495BD4F8">
+            <wp:extent cx="5943600" cy="2330450"/>
+            <wp:effectExtent l="0" t="0" r="0" b="0"/>
+            <wp:docPr id="107376966" name="Picture 1"/>
             <wp:cNvGraphicFramePr>
               <a:graphicFrameLocks xmlns:a="http://schemas.openxmlformats.org/drawingml/2006/main" noChangeAspect="1"/>
             </wp:cNvGraphicFramePr>
@@ -305,7 +310,7 @@
               <a:graphicData uri="http://schemas.openxmlformats.org/drawingml/2006/picture">
                 <pic:pic xmlns:pic="http://schemas.openxmlformats.org/drawingml/2006/picture">
                   <pic:nvPicPr>
-                    <pic:cNvPr id="1451810450" name=""/>
+                    <pic:cNvPr id="107376966" name=""/>
                     <pic:cNvPicPr/>
                   </pic:nvPicPr>
                   <pic:blipFill>
@@ -317,7 +322,7 @@
                   <pic:spPr>
                     <a:xfrm>
                       <a:off x="0" y="0"/>
-                      <a:ext cx="5943600" cy="2259330"/>
+                      <a:ext cx="5943600" cy="2330450"/>
                     </a:xfrm>
                     <a:prstGeom prst="rect">
                       <a:avLst/>
@@ -339,13 +344,23 @@
           <w:bCs/>
         </w:rPr>
       </w:pPr>
-      <w:r>
-        <w:rPr>
-          <w:rFonts w:ascii="Arial" w:hAnsi="Arial" w:cs="Arial"/>
-          <w:b/>
-          <w:bCs/>
-        </w:rPr>
-        <w:t>Logging User In</w:t>
+      <w:proofErr w:type="spellStart"/>
+      <w:r>
+        <w:rPr>
+          <w:rFonts w:ascii="Arial" w:hAnsi="Arial" w:cs="Arial"/>
+          <w:b/>
+          <w:bCs/>
+        </w:rPr>
+        <w:t>Mixin</w:t>
+      </w:r>
+      <w:proofErr w:type="spellEnd"/>
+      <w:r>
+        <w:rPr>
+          <w:rFonts w:ascii="Arial" w:hAnsi="Arial" w:cs="Arial"/>
+          <w:b/>
+          <w:bCs/>
+        </w:rPr>
+        <w:t xml:space="preserve"> showing Custom 403 Error page on edit/delete request</w:t>
       </w:r>
     </w:p>
     <w:p>
@@ -365,10 +380,10 @@
         </w:rPr>
         <w:lastRenderedPageBreak/>
         <w:drawing>
-          <wp:inline distT="0" distB="0" distL="0" distR="0" wp14:anchorId="11E65F8B" wp14:editId="39C7402C">
-            <wp:extent cx="5943600" cy="2148840"/>
-            <wp:effectExtent l="0" t="0" r="0" b="3810"/>
-            <wp:docPr id="103787437" name="Picture 1"/>
+          <wp:inline distT="0" distB="0" distL="0" distR="0" wp14:anchorId="31FD0C0F" wp14:editId="5E8A8CD4">
+            <wp:extent cx="5943600" cy="1997710"/>
+            <wp:effectExtent l="0" t="0" r="0" b="2540"/>
+            <wp:docPr id="1728981743" name="Picture 1"/>
             <wp:cNvGraphicFramePr>
               <a:graphicFrameLocks xmlns:a="http://schemas.openxmlformats.org/drawingml/2006/main" noChangeAspect="1"/>
             </wp:cNvGraphicFramePr>
@@ -376,7 +391,7 @@
               <a:graphicData uri="http://schemas.openxmlformats.org/drawingml/2006/picture">
                 <pic:pic xmlns:pic="http://schemas.openxmlformats.org/drawingml/2006/picture">
                   <pic:nvPicPr>
-                    <pic:cNvPr id="103787437" name=""/>
+                    <pic:cNvPr id="1728981743" name=""/>
                     <pic:cNvPicPr/>
                   </pic:nvPicPr>
                   <pic:blipFill>
@@ -388,7 +403,7 @@
                   <pic:spPr>
                     <a:xfrm>
                       <a:off x="0" y="0"/>
-                      <a:ext cx="5943600" cy="2148840"/>
+                      <a:ext cx="5943600" cy="1997710"/>
                     </a:xfrm>
                     <a:prstGeom prst="rect">
                       <a:avLst/>
@@ -410,66 +425,6 @@
           <w:bCs/>
         </w:rPr>
       </w:pPr>
-      <w:r>
-        <w:rPr>
-          <w:rFonts w:ascii="Arial" w:hAnsi="Arial" w:cs="Arial"/>
-          <w:b/>
-          <w:bCs/>
-        </w:rPr>
-        <w:t>Logging User Out</w:t>
-      </w:r>
-    </w:p>
-    <w:p>
-      <w:pPr>
-        <w:spacing w:line="360" w:lineRule="auto"/>
-        <w:rPr>
-          <w:rFonts w:ascii="Arial" w:hAnsi="Arial" w:cs="Arial"/>
-          <w:b/>
-          <w:bCs/>
-        </w:rPr>
-      </w:pPr>
-      <w:r>
-        <w:rPr>
-          <w:rFonts w:ascii="Arial" w:hAnsi="Arial" w:cs="Arial"/>
-          <w:b/>
-          <w:bCs/>
-        </w:rPr>
-        <w:drawing>
-          <wp:inline distT="0" distB="0" distL="0" distR="0" wp14:anchorId="2ED3189B" wp14:editId="19DFDE54">
-            <wp:extent cx="5943600" cy="1687830"/>
-            <wp:effectExtent l="0" t="0" r="0" b="7620"/>
-            <wp:docPr id="368190497" name="Picture 1"/>
-            <wp:cNvGraphicFramePr>
-              <a:graphicFrameLocks xmlns:a="http://schemas.openxmlformats.org/drawingml/2006/main" noChangeAspect="1"/>
-            </wp:cNvGraphicFramePr>
-            <a:graphic xmlns:a="http://schemas.openxmlformats.org/drawingml/2006/main">
-              <a:graphicData uri="http://schemas.openxmlformats.org/drawingml/2006/picture">
-                <pic:pic xmlns:pic="http://schemas.openxmlformats.org/drawingml/2006/picture">
-                  <pic:nvPicPr>
-                    <pic:cNvPr id="368190497" name=""/>
-                    <pic:cNvPicPr/>
-                  </pic:nvPicPr>
-                  <pic:blipFill>
-                    <a:blip r:embed="rId10"/>
-                    <a:stretch>
-                      <a:fillRect/>
-                    </a:stretch>
-                  </pic:blipFill>
-                  <pic:spPr>
-                    <a:xfrm>
-                      <a:off x="0" y="0"/>
-                      <a:ext cx="5943600" cy="1687830"/>
-                    </a:xfrm>
-                    <a:prstGeom prst="rect">
-                      <a:avLst/>
-                    </a:prstGeom>
-                  </pic:spPr>
-                </pic:pic>
-              </a:graphicData>
-            </a:graphic>
-          </wp:inline>
-        </w:drawing>
-      </w:r>
     </w:p>
     <w:p>
       <w:pPr>
@@ -562,7 +517,7 @@
       </w:pPr>
     </w:p>
     <w:sectPr>
-      <w:headerReference w:type="default" r:id="rId11"/>
+      <w:headerReference w:type="default" r:id="rId10"/>
       <w:pgSz w:w="12240" w:h="15840"/>
       <w:pgMar w:top="1440" w:right="1440" w:bottom="1440" w:left="1440" w:header="708" w:footer="708" w:gutter="0"/>
       <w:cols w:space="708"/>

</xml_diff>